<commit_message>
[untested] Enhance ATS scoring with phrase matching and update experience data to include Compare the Market role
</commit_message>
<xml_diff>
--- a/resources/template.docx
+++ b/resources/template.docx
@@ -22,6 +22,9 @@
       </w:pPr>
       <w:r>
         <w:t>SOFTWARE ENGINEER</w:t>
+      </w:r>
+      <w:r>
+        <w:t xml:space="preserve"> – AI NATIVE PLATFORMS</w:t>
       </w:r>
     </w:p>
     <w:p>
@@ -573,35 +576,86 @@
         <w:ind w:left="0" w:firstLine="0"/>
       </w:pPr>
     </w:p>
-    <w:p/>
-    <w:p/>
-    <w:p/>
     <w:p>
       <w:pPr>
         <w:ind w:left="0" w:firstLine="0"/>
       </w:pPr>
     </w:p>
-    <w:p/>
-    <w:p/>
     <w:p>
       <w:pPr>
         <w:ind w:left="0" w:firstLine="0"/>
       </w:pPr>
     </w:p>
-    <w:p/>
+    <w:p>
+      <w:pPr>
+        <w:ind w:left="0" w:firstLine="0"/>
+      </w:pPr>
+    </w:p>
+    <w:p>
+      <w:pPr>
+        <w:ind w:left="0" w:firstLine="0"/>
+      </w:pPr>
+    </w:p>
+    <w:p>
+      <w:pPr>
+        <w:ind w:left="0" w:firstLine="0"/>
+      </w:pPr>
+    </w:p>
+    <w:p>
+      <w:pPr>
+        <w:ind w:left="0" w:firstLine="0"/>
+      </w:pPr>
+    </w:p>
+    <w:p>
+      <w:pPr>
+        <w:ind w:left="0" w:firstLine="0"/>
+      </w:pPr>
+    </w:p>
+    <w:p>
+      <w:pPr>
+        <w:ind w:left="0" w:firstLine="0"/>
+      </w:pPr>
+    </w:p>
+    <w:p>
+      <w:pPr>
+        <w:ind w:left="0" w:firstLine="0"/>
+      </w:pPr>
+    </w:p>
+    <w:p>
+      <w:pPr>
+        <w:ind w:left="0" w:firstLine="0"/>
+      </w:pPr>
+    </w:p>
+    <w:p>
+      <w:pPr>
+        <w:ind w:left="0" w:firstLine="0"/>
+      </w:pPr>
+    </w:p>
+    <w:p>
+      <w:pPr>
+        <w:ind w:left="0" w:firstLine="0"/>
+      </w:pPr>
+    </w:p>
+    <w:p>
+      <w:pPr>
+        <w:ind w:left="0" w:firstLine="0"/>
+      </w:pPr>
+    </w:p>
+    <w:p>
+      <w:pPr>
+        <w:ind w:left="0" w:firstLine="0"/>
+      </w:pPr>
+    </w:p>
+    <w:p>
+      <w:pPr>
+        <w:ind w:left="0" w:firstLine="0"/>
+      </w:pPr>
+    </w:p>
     <w:p>
       <w:pPr>
         <w:pStyle w:val="Heading2"/>
         <w:spacing w:after="131"/>
         <w:ind w:right="60"/>
-        <w:jc w:val="left"/>
-      </w:pPr>
-    </w:p>
-    <w:p>
-      <w:pPr>
-        <w:pStyle w:val="Heading2"/>
-        <w:spacing w:after="131"/>
-        <w:ind w:right="60"/>
       </w:pPr>
       <w:r>
         <w:t xml:space="preserve">EXPERIENCE </w:t>
@@ -636,19 +690,7 @@
         <w:rPr>
           <w:i/>
         </w:rPr>
-        <w:t xml:space="preserve">T Rowe Price | </w:t>
-      </w:r>
-      <w:r>
-        <w:rPr>
-          <w:i/>
-        </w:rPr>
-        <w:t>October 202</w:t>
-      </w:r>
-      <w:r>
-        <w:rPr>
-          <w:i/>
-        </w:rPr>
-        <w:t>3 – Present</w:t>
+        <w:t>Compare The Market | October 2025 – Present</w:t>
       </w:r>
     </w:p>
     <w:p>
@@ -672,7 +714,7 @@
           <w:sz w:val="19"/>
           <w:szCs w:val="19"/>
         </w:rPr>
-        <w:t>Enterprise migrations and cloud architecture for core finance systems</w:t>
+        <w:t>AI Native Engineering across internal and external systems</w:t>
       </w:r>
     </w:p>
     <w:p>
@@ -687,41 +729,27 @@
           <w:sz w:val="16"/>
           <w:szCs w:val="21"/>
         </w:rPr>
-        <w:t xml:space="preserve">Key tech stack: </w:t>
-      </w:r>
+        <w:t>Key tech stack: {{</w:t>
+      </w:r>
+      <w:proofErr w:type="spellStart"/>
+      <w:proofErr w:type="gramStart"/>
       <w:r>
         <w:rPr>
           <w:i/>
           <w:sz w:val="16"/>
           <w:szCs w:val="21"/>
         </w:rPr>
-        <w:t>{{</w:t>
-      </w:r>
-      <w:proofErr w:type="spellStart"/>
+        <w:t>c.skills</w:t>
+      </w:r>
+      <w:proofErr w:type="spellEnd"/>
+      <w:proofErr w:type="gramEnd"/>
       <w:r>
         <w:rPr>
           <w:i/>
           <w:sz w:val="16"/>
           <w:szCs w:val="21"/>
         </w:rPr>
-        <w:t>t.skills</w:t>
-      </w:r>
-      <w:proofErr w:type="spellEnd"/>
-      <w:r>
-        <w:rPr>
-          <w:i/>
-          <w:sz w:val="16"/>
-          <w:szCs w:val="21"/>
-        </w:rPr>
-        <w:t>}}</w:t>
-      </w:r>
-      <w:r>
-        <w:rPr>
-          <w:i/>
-          <w:sz w:val="16"/>
-          <w:szCs w:val="21"/>
-        </w:rPr>
-        <w:t xml:space="preserve"> </w:t>
+        <w:t xml:space="preserve">}} </w:t>
       </w:r>
     </w:p>
     <w:p>
@@ -738,21 +766,7 @@
           <w:b/>
           <w:bCs/>
         </w:rPr>
-        <w:t>Production Finance</w:t>
-      </w:r>
-      <w:r>
-        <w:rPr>
-          <w:b/>
-          <w:bCs/>
-        </w:rPr>
-        <w:t xml:space="preserve"> Data Migration</w:t>
-      </w:r>
-      <w:r>
-        <w:rPr>
-          <w:b/>
-          <w:bCs/>
-        </w:rPr>
-        <w:t>s</w:t>
+        <w:t>Multi layered agent orchestrations to automate Product processes</w:t>
       </w:r>
     </w:p>
     <w:p>
@@ -780,31 +794,14 @@
           <w:sz w:val="18"/>
           <w:szCs w:val="18"/>
         </w:rPr>
-        <w:t>t.</w:t>
-      </w:r>
-      <w:r>
-        <w:rPr>
-          <w:sz w:val="18"/>
-          <w:szCs w:val="18"/>
-        </w:rPr>
-        <w:t>bp1}}</w:t>
-      </w:r>
-    </w:p>
-    <w:p>
-      <w:pPr>
-        <w:spacing w:after="0" w:line="259" w:lineRule="auto"/>
-        <w:ind w:left="0" w:firstLine="0"/>
-        <w:rPr>
-          <w:b/>
-          <w:bCs/>
-        </w:rPr>
-      </w:pPr>
-      <w:r>
-        <w:rPr>
-          <w:b/>
-          <w:bCs/>
-        </w:rPr>
-        <w:t>Legacy to Cloud Migration</w:t>
+        <w:t>c</w:t>
+      </w:r>
+      <w:r>
+        <w:rPr>
+          <w:sz w:val="18"/>
+          <w:szCs w:val="18"/>
+        </w:rPr>
+        <w:t>.bp1}}</w:t>
       </w:r>
     </w:p>
     <w:p>
@@ -832,14 +829,14 @@
           <w:sz w:val="18"/>
           <w:szCs w:val="18"/>
         </w:rPr>
-        <w:t>t.</w:t>
-      </w:r>
-      <w:r>
-        <w:rPr>
-          <w:sz w:val="18"/>
-          <w:szCs w:val="18"/>
-        </w:rPr>
-        <w:t>bp</w:t>
+        <w:t>c</w:t>
+      </w:r>
+      <w:r>
+        <w:rPr>
+          <w:sz w:val="18"/>
+          <w:szCs w:val="18"/>
+        </w:rPr>
+        <w:t>.bp</w:t>
       </w:r>
       <w:r>
         <w:rPr>
@@ -870,7 +867,7 @@
           <w:b/>
           <w:bCs/>
         </w:rPr>
-        <w:t>Disaster Recovery Implementation</w:t>
+        <w:t>Software Development Lifecycle Improvements</w:t>
       </w:r>
     </w:p>
     <w:p>
@@ -898,14 +895,14 @@
           <w:sz w:val="18"/>
           <w:szCs w:val="18"/>
         </w:rPr>
-        <w:t>t.</w:t>
-      </w:r>
-      <w:r>
-        <w:rPr>
-          <w:sz w:val="18"/>
-          <w:szCs w:val="18"/>
-        </w:rPr>
-        <w:t>bp</w:t>
+        <w:t>c</w:t>
+      </w:r>
+      <w:r>
+        <w:rPr>
+          <w:sz w:val="18"/>
+          <w:szCs w:val="18"/>
+        </w:rPr>
+        <w:t>.bp</w:t>
       </w:r>
       <w:r>
         <w:rPr>
@@ -936,7 +933,7 @@
           <w:b/>
           <w:bCs/>
         </w:rPr>
-        <w:t>Internal Directory Integration</w:t>
+        <w:t>Mentoring and building others skillsets</w:t>
       </w:r>
     </w:p>
     <w:p>
@@ -957,6 +954,388 @@
           <w:sz w:val="18"/>
           <w:szCs w:val="18"/>
         </w:rPr>
+        <w:t>{{</w:t>
+      </w:r>
+      <w:r>
+        <w:rPr>
+          <w:sz w:val="18"/>
+          <w:szCs w:val="18"/>
+        </w:rPr>
+        <w:t>c</w:t>
+      </w:r>
+      <w:r>
+        <w:rPr>
+          <w:sz w:val="18"/>
+          <w:szCs w:val="18"/>
+        </w:rPr>
+        <w:t>.bp</w:t>
+      </w:r>
+      <w:r>
+        <w:rPr>
+          <w:sz w:val="18"/>
+          <w:szCs w:val="18"/>
+        </w:rPr>
+        <w:t>4</w:t>
+      </w:r>
+      <w:r>
+        <w:rPr>
+          <w:sz w:val="18"/>
+          <w:szCs w:val="18"/>
+        </w:rPr>
+        <w:t>}}</w:t>
+      </w:r>
+    </w:p>
+    <w:p/>
+    <w:p>
+      <w:pPr>
+        <w:pStyle w:val="Heading3"/>
+        <w:rPr>
+          <w:sz w:val="21"/>
+          <w:szCs w:val="28"/>
+        </w:rPr>
+      </w:pPr>
+      <w:r>
+        <w:rPr>
+          <w:sz w:val="21"/>
+          <w:szCs w:val="28"/>
+        </w:rPr>
+        <w:t xml:space="preserve">Software Engineer </w:t>
+      </w:r>
+    </w:p>
+    <w:p>
+      <w:pPr>
+        <w:spacing w:after="0" w:line="259" w:lineRule="auto"/>
+        <w:ind w:right="45"/>
+        <w:jc w:val="center"/>
+        <w:rPr>
+          <w:i/>
+        </w:rPr>
+      </w:pPr>
+      <w:r>
+        <w:rPr>
+          <w:i/>
+        </w:rPr>
+        <w:t xml:space="preserve">T Rowe Price | </w:t>
+      </w:r>
+      <w:r>
+        <w:rPr>
+          <w:i/>
+        </w:rPr>
+        <w:t>October 202</w:t>
+      </w:r>
+      <w:r>
+        <w:rPr>
+          <w:i/>
+        </w:rPr>
+        <w:t>3 – Present</w:t>
+      </w:r>
+    </w:p>
+    <w:p>
+      <w:pPr>
+        <w:spacing w:after="0" w:line="259" w:lineRule="auto"/>
+        <w:ind w:right="45"/>
+        <w:jc w:val="center"/>
+        <w:rPr>
+          <w:b/>
+          <w:bCs/>
+          <w:i/>
+          <w:sz w:val="19"/>
+          <w:szCs w:val="19"/>
+        </w:rPr>
+      </w:pPr>
+      <w:r>
+        <w:rPr>
+          <w:b/>
+          <w:bCs/>
+          <w:i/>
+          <w:sz w:val="19"/>
+          <w:szCs w:val="19"/>
+        </w:rPr>
+        <w:t>Enterprise migrations and cloud architecture for core finance systems</w:t>
+      </w:r>
+    </w:p>
+    <w:p>
+      <w:pPr>
+        <w:spacing w:after="0" w:line="259" w:lineRule="auto"/>
+        <w:ind w:right="45"/>
+        <w:jc w:val="center"/>
+      </w:pPr>
+      <w:r>
+        <w:rPr>
+          <w:i/>
+          <w:sz w:val="16"/>
+          <w:szCs w:val="21"/>
+        </w:rPr>
+        <w:t xml:space="preserve">Key tech stack: </w:t>
+      </w:r>
+      <w:r>
+        <w:rPr>
+          <w:i/>
+          <w:sz w:val="16"/>
+          <w:szCs w:val="21"/>
+        </w:rPr>
+        <w:t>{{</w:t>
+      </w:r>
+      <w:proofErr w:type="spellStart"/>
+      <w:r>
+        <w:rPr>
+          <w:i/>
+          <w:sz w:val="16"/>
+          <w:szCs w:val="21"/>
+        </w:rPr>
+        <w:t>t.skills</w:t>
+      </w:r>
+      <w:proofErr w:type="spellEnd"/>
+      <w:r>
+        <w:rPr>
+          <w:i/>
+          <w:sz w:val="16"/>
+          <w:szCs w:val="21"/>
+        </w:rPr>
+        <w:t>}}</w:t>
+      </w:r>
+      <w:r>
+        <w:rPr>
+          <w:i/>
+          <w:sz w:val="16"/>
+          <w:szCs w:val="21"/>
+        </w:rPr>
+        <w:t xml:space="preserve"> </w:t>
+      </w:r>
+    </w:p>
+    <w:p>
+      <w:pPr>
+        <w:spacing w:after="0" w:line="259" w:lineRule="auto"/>
+        <w:ind w:left="0" w:firstLine="0"/>
+        <w:rPr>
+          <w:b/>
+          <w:bCs/>
+        </w:rPr>
+      </w:pPr>
+      <w:r>
+        <w:rPr>
+          <w:b/>
+          <w:bCs/>
+        </w:rPr>
+        <w:t>Production Finance</w:t>
+      </w:r>
+      <w:r>
+        <w:rPr>
+          <w:b/>
+          <w:bCs/>
+        </w:rPr>
+        <w:t xml:space="preserve"> Data Migration</w:t>
+      </w:r>
+      <w:r>
+        <w:rPr>
+          <w:b/>
+          <w:bCs/>
+        </w:rPr>
+        <w:t>s</w:t>
+      </w:r>
+    </w:p>
+    <w:p>
+      <w:pPr>
+        <w:pStyle w:val="ListParagraph"/>
+        <w:numPr>
+          <w:ilvl w:val="0"/>
+          <w:numId w:val="5"/>
+        </w:numPr>
+        <w:spacing w:after="0" w:line="259" w:lineRule="auto"/>
+        <w:rPr>
+          <w:sz w:val="18"/>
+          <w:szCs w:val="18"/>
+        </w:rPr>
+      </w:pPr>
+      <w:r>
+        <w:rPr>
+          <w:sz w:val="18"/>
+          <w:szCs w:val="18"/>
+        </w:rPr>
+        <w:t>{{</w:t>
+      </w:r>
+      <w:r>
+        <w:rPr>
+          <w:sz w:val="18"/>
+          <w:szCs w:val="18"/>
+        </w:rPr>
+        <w:t>t.</w:t>
+      </w:r>
+      <w:r>
+        <w:rPr>
+          <w:sz w:val="18"/>
+          <w:szCs w:val="18"/>
+        </w:rPr>
+        <w:t>bp1}}</w:t>
+      </w:r>
+    </w:p>
+    <w:p>
+      <w:pPr>
+        <w:spacing w:after="0" w:line="259" w:lineRule="auto"/>
+        <w:ind w:left="0" w:firstLine="0"/>
+        <w:rPr>
+          <w:b/>
+          <w:bCs/>
+        </w:rPr>
+      </w:pPr>
+      <w:r>
+        <w:rPr>
+          <w:b/>
+          <w:bCs/>
+        </w:rPr>
+        <w:t>Legacy to Cloud Migration</w:t>
+      </w:r>
+    </w:p>
+    <w:p>
+      <w:pPr>
+        <w:pStyle w:val="ListParagraph"/>
+        <w:numPr>
+          <w:ilvl w:val="0"/>
+          <w:numId w:val="5"/>
+        </w:numPr>
+        <w:spacing w:after="0" w:line="259" w:lineRule="auto"/>
+        <w:rPr>
+          <w:sz w:val="18"/>
+          <w:szCs w:val="18"/>
+        </w:rPr>
+      </w:pPr>
+      <w:r>
+        <w:rPr>
+          <w:sz w:val="18"/>
+          <w:szCs w:val="18"/>
+        </w:rPr>
+        <w:t>{{</w:t>
+      </w:r>
+      <w:r>
+        <w:rPr>
+          <w:sz w:val="18"/>
+          <w:szCs w:val="18"/>
+        </w:rPr>
+        <w:t>t.</w:t>
+      </w:r>
+      <w:r>
+        <w:rPr>
+          <w:sz w:val="18"/>
+          <w:szCs w:val="18"/>
+        </w:rPr>
+        <w:t>bp</w:t>
+      </w:r>
+      <w:r>
+        <w:rPr>
+          <w:sz w:val="18"/>
+          <w:szCs w:val="18"/>
+        </w:rPr>
+        <w:t>2</w:t>
+      </w:r>
+      <w:r>
+        <w:rPr>
+          <w:sz w:val="18"/>
+          <w:szCs w:val="18"/>
+        </w:rPr>
+        <w:t>}}</w:t>
+      </w:r>
+    </w:p>
+    <w:p>
+      <w:pPr>
+        <w:spacing w:after="0" w:line="259" w:lineRule="auto"/>
+        <w:ind w:left="0" w:firstLine="0"/>
+        <w:rPr>
+          <w:b/>
+          <w:bCs/>
+        </w:rPr>
+      </w:pPr>
+      <w:r>
+        <w:rPr>
+          <w:b/>
+          <w:bCs/>
+        </w:rPr>
+        <w:t>Disaster Recovery Implementation</w:t>
+      </w:r>
+    </w:p>
+    <w:p>
+      <w:pPr>
+        <w:pStyle w:val="ListParagraph"/>
+        <w:numPr>
+          <w:ilvl w:val="0"/>
+          <w:numId w:val="5"/>
+        </w:numPr>
+        <w:spacing w:after="0" w:line="259" w:lineRule="auto"/>
+        <w:rPr>
+          <w:sz w:val="18"/>
+          <w:szCs w:val="18"/>
+        </w:rPr>
+      </w:pPr>
+      <w:r>
+        <w:rPr>
+          <w:sz w:val="18"/>
+          <w:szCs w:val="18"/>
+        </w:rPr>
+        <w:t>{{</w:t>
+      </w:r>
+      <w:r>
+        <w:rPr>
+          <w:sz w:val="18"/>
+          <w:szCs w:val="18"/>
+        </w:rPr>
+        <w:t>t.</w:t>
+      </w:r>
+      <w:r>
+        <w:rPr>
+          <w:sz w:val="18"/>
+          <w:szCs w:val="18"/>
+        </w:rPr>
+        <w:t>bp</w:t>
+      </w:r>
+      <w:r>
+        <w:rPr>
+          <w:sz w:val="18"/>
+          <w:szCs w:val="18"/>
+        </w:rPr>
+        <w:t>3</w:t>
+      </w:r>
+      <w:r>
+        <w:rPr>
+          <w:sz w:val="18"/>
+          <w:szCs w:val="18"/>
+        </w:rPr>
+        <w:t>}}</w:t>
+      </w:r>
+    </w:p>
+    <w:p>
+      <w:pPr>
+        <w:spacing w:after="0" w:line="259" w:lineRule="auto"/>
+        <w:ind w:left="0" w:firstLine="0"/>
+        <w:rPr>
+          <w:b/>
+          <w:bCs/>
+        </w:rPr>
+      </w:pPr>
+      <w:r>
+        <w:rPr>
+          <w:b/>
+          <w:bCs/>
+        </w:rPr>
+        <w:t>Internal Directory Integration</w:t>
+      </w:r>
+    </w:p>
+    <w:p>
+      <w:pPr>
+        <w:pStyle w:val="ListParagraph"/>
+        <w:numPr>
+          <w:ilvl w:val="0"/>
+          <w:numId w:val="5"/>
+        </w:numPr>
+        <w:spacing w:after="0" w:line="259" w:lineRule="auto"/>
+        <w:rPr>
+          <w:sz w:val="18"/>
+          <w:szCs w:val="18"/>
+        </w:rPr>
+      </w:pPr>
+      <w:r>
+        <w:rPr>
+          <w:sz w:val="18"/>
+          <w:szCs w:val="18"/>
+        </w:rPr>
         <w:t>{{t.bp</w:t>
       </w:r>
       <w:r>
@@ -1187,53 +1566,6 @@
         </w:rPr>
         <w:t>{{a.bp2}}</w:t>
       </w:r>
-    </w:p>
-    <w:p>
-      <w:pPr>
-        <w:ind w:left="0" w:right="5" w:firstLine="0"/>
-        <w:rPr>
-          <w:b/>
-          <w:bCs/>
-        </w:rPr>
-      </w:pPr>
-      <w:r>
-        <w:rPr>
-          <w:b/>
-          <w:bCs/>
-        </w:rPr>
-        <w:t>Security &amp; Governance</w:t>
-      </w:r>
-    </w:p>
-    <w:p>
-      <w:pPr>
-        <w:pStyle w:val="ListParagraph"/>
-        <w:numPr>
-          <w:ilvl w:val="0"/>
-          <w:numId w:val="6"/>
-        </w:numPr>
-        <w:spacing w:after="0" w:line="259" w:lineRule="auto"/>
-        <w:rPr>
-          <w:sz w:val="18"/>
-          <w:szCs w:val="18"/>
-        </w:rPr>
-      </w:pPr>
-      <w:r>
-        <w:rPr>
-          <w:sz w:val="18"/>
-          <w:szCs w:val="18"/>
-        </w:rPr>
-        <w:t>{{a.bp3}}</w:t>
-      </w:r>
-    </w:p>
-    <w:p>
-      <w:pPr>
-        <w:spacing w:after="0" w:line="240" w:lineRule="auto"/>
-        <w:ind w:left="0" w:firstLine="0"/>
-        <w:rPr>
-          <w:sz w:val="18"/>
-          <w:szCs w:val="18"/>
-        </w:rPr>
-      </w:pPr>
       <w:r>
         <w:rPr>
           <w:sz w:val="18"/>

</xml_diff>

<commit_message>
Update Compare the Market bullets to use placeholder substitution for dynamic skill matching from job descriptions
</commit_message>
<xml_diff>
--- a/resources/template.docx
+++ b/resources/template.docx
@@ -204,7 +204,7 @@
           </mc:Choice>
           <mc:Fallback>
             <w:pict>
-              <v:group w14:anchorId="5A3ECC33" id="Group 2239" o:spid="_x0000_s1026" style="position:absolute;margin-left:126.85pt;margin-top:15.2pt;width:0;height:558pt;z-index:251658240" coordsize="0,70866" o:gfxdata="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">
+              <v:group w14:anchorId="36D18867" id="Group 2239" o:spid="_x0000_s1026" style="position:absolute;margin-left:126.85pt;margin-top:15.2pt;width:0;height:558pt;z-index:251658240" coordsize="0,70866" o:gfxdata="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">
                 <v:shape id="Shape 330" o:spid="_x0000_s1027" style="position:absolute;width:0;height:70866;visibility:visible;mso-wrap-style:square;v-text-anchor:top" coordsize="1,7086600" o:gfxdata="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" path="m,l1,7086600e" filled="f" strokecolor="#a0a0a0" strokeweight=".5pt">
                   <v:stroke miterlimit="66585f" joinstyle="miter"/>
                   <v:path arrowok="t" textboxrect="0,0,1,7086600"/>
@@ -566,17 +566,6 @@
     </w:p>
     <w:p>
       <w:pPr>
-        <w:tabs>
-          <w:tab w:val="center" w:pos="1450"/>
-          <w:tab w:val="right" w:pos="2816"/>
-        </w:tabs>
-        <w:spacing w:after="0" w:line="259" w:lineRule="auto"/>
-        <w:ind w:left="0" w:firstLine="0"/>
-        <w:jc w:val="center"/>
-      </w:pPr>
-    </w:p>
-    <w:p>
-      <w:pPr>
         <w:spacing w:after="19" w:line="259" w:lineRule="auto"/>
         <w:ind w:left="0" w:firstLine="0"/>
         <w:jc w:val="center"/>
@@ -757,32 +746,6 @@
     </w:p>
     <w:p>
       <w:pPr>
-        <w:spacing w:after="0" w:line="259" w:lineRule="auto"/>
-        <w:ind w:left="0" w:right="48" w:firstLine="0"/>
-        <w:jc w:val="center"/>
-        <w:rPr>
-          <w:sz w:val="19"/>
-          <w:szCs w:val="19"/>
-        </w:rPr>
-      </w:pPr>
-    </w:p>
-    <w:p>
-      <w:pPr>
-        <w:ind w:left="0" w:firstLine="0"/>
-      </w:pPr>
-    </w:p>
-    <w:p>
-      <w:pPr>
-        <w:ind w:left="0" w:firstLine="0"/>
-      </w:pPr>
-    </w:p>
-    <w:p>
-      <w:pPr>
-        <w:ind w:left="0" w:firstLine="0"/>
-      </w:pPr>
-    </w:p>
-    <w:p>
-      <w:pPr>
         <w:ind w:left="0" w:firstLine="0"/>
       </w:pPr>
     </w:p>
@@ -828,6 +791,9 @@
       <w:r>
         <w:t xml:space="preserve">Software Engineer </w:t>
       </w:r>
+      <w:r>
+        <w:t>- AI</w:t>
+      </w:r>
     </w:p>
     <w:p>
       <w:pPr>
@@ -886,7 +852,49 @@
           <w:sz w:val="18"/>
           <w:szCs w:val="18"/>
         </w:rPr>
-        <w:t>AI Native Engineering across internal and external systems</w:t>
+        <w:t xml:space="preserve">AI Native Engineering </w:t>
+      </w:r>
+      <w:r>
+        <w:rPr>
+          <w:b/>
+          <w:bCs/>
+          <w:i/>
+          <w:sz w:val="18"/>
+          <w:szCs w:val="18"/>
+        </w:rPr>
+        <w:t xml:space="preserve">Automating </w:t>
+      </w:r>
+      <w:proofErr w:type="spellStart"/>
+      <w:r>
+        <w:rPr>
+          <w:b/>
+          <w:bCs/>
+          <w:i/>
+          <w:sz w:val="18"/>
+          <w:szCs w:val="18"/>
+        </w:rPr>
+        <w:t xml:space="preserve">Company </w:t>
+      </w:r>
+      <w:r>
+        <w:rPr>
+          <w:b/>
+          <w:bCs/>
+          <w:i/>
+          <w:sz w:val="18"/>
+          <w:szCs w:val="18"/>
+        </w:rPr>
+        <w:t>wide</w:t>
+      </w:r>
+      <w:proofErr w:type="spellEnd"/>
+      <w:r>
+        <w:rPr>
+          <w:b/>
+          <w:bCs/>
+          <w:i/>
+          <w:sz w:val="18"/>
+          <w:szCs w:val="18"/>
+        </w:rPr>
+        <w:t xml:space="preserve"> systems</w:t>
       </w:r>
     </w:p>
     <w:p>
@@ -1118,6 +1126,9 @@
       <w:r>
         <w:t xml:space="preserve">Software Engineer </w:t>
       </w:r>
+      <w:r>
+        <w:t>– Platform Engineering</w:t>
+      </w:r>
     </w:p>
     <w:p>
       <w:pPr>
@@ -1543,6 +1554,15 @@
       </w:pPr>
       <w:r>
         <w:t>Systems Analyst</w:t>
+      </w:r>
+      <w:r>
+        <w:t xml:space="preserve"> – </w:t>
+      </w:r>
+      <w:r>
+        <w:t xml:space="preserve">Platform </w:t>
+      </w:r>
+      <w:r>
+        <w:t>Automations</w:t>
       </w:r>
     </w:p>
     <w:p>

</xml_diff>

<commit_message>
Remove personal data files and reorganize .gitignore with clearer categorization and comprehensive exclusion patterns
</commit_message>
<xml_diff>
--- a/resources/template.docx
+++ b/resources/template.docx
@@ -18,19 +18,20 @@
     </w:p>
     <w:p>
       <w:pPr>
-        <w:pStyle w:val="Heading1"/>
-      </w:pPr>
-      <w:r>
-        <w:t>SOFTWARE ENGINEER</w:t>
-      </w:r>
-      <w:r>
-        <w:t xml:space="preserve"> </w:t>
-      </w:r>
-      <w:r>
-        <w:t>-</w:t>
-      </w:r>
-      <w:r>
-        <w:t xml:space="preserve"> AI NATIVE PLATFORMS</w:t>
+        <w:spacing w:after="115" w:line="259" w:lineRule="auto"/>
+        <w:ind w:left="0" w:firstLine="0"/>
+        <w:jc w:val="center"/>
+        <w:rPr>
+          <w:color w:val="5A5A5A"/>
+          <w:sz w:val="21"/>
+        </w:rPr>
+      </w:pPr>
+      <w:r>
+        <w:rPr>
+          <w:color w:val="5A5A5A"/>
+          <w:sz w:val="21"/>
+        </w:rPr>
+        <w:t>Software Engineer - AI Systems &amp; Platform Engineering</w:t>
       </w:r>
     </w:p>
     <w:p>
@@ -446,16 +447,6 @@
     </w:p>
     <w:p>
       <w:pPr>
-        <w:spacing w:after="25"/>
-        <w:ind w:right="180" w:firstLine="160"/>
-        <w:jc w:val="center"/>
-      </w:pPr>
-      <w:r>
-        <w:t>2022 Graduation</w:t>
-      </w:r>
-    </w:p>
-    <w:p>
-      <w:pPr>
         <w:tabs>
           <w:tab w:val="center" w:pos="1450"/>
           <w:tab w:val="right" w:pos="2816"/>
@@ -852,49 +843,7 @@
           <w:sz w:val="18"/>
           <w:szCs w:val="18"/>
         </w:rPr>
-        <w:t xml:space="preserve">AI Native Engineering </w:t>
-      </w:r>
-      <w:r>
-        <w:rPr>
-          <w:b/>
-          <w:bCs/>
-          <w:i/>
-          <w:sz w:val="18"/>
-          <w:szCs w:val="18"/>
-        </w:rPr>
-        <w:t xml:space="preserve">Automating </w:t>
-      </w:r>
-      <w:proofErr w:type="spellStart"/>
-      <w:r>
-        <w:rPr>
-          <w:b/>
-          <w:bCs/>
-          <w:i/>
-          <w:sz w:val="18"/>
-          <w:szCs w:val="18"/>
-        </w:rPr>
-        <w:t xml:space="preserve">Company </w:t>
-      </w:r>
-      <w:r>
-        <w:rPr>
-          <w:b/>
-          <w:bCs/>
-          <w:i/>
-          <w:sz w:val="18"/>
-          <w:szCs w:val="18"/>
-        </w:rPr>
-        <w:t>wide</w:t>
-      </w:r>
-      <w:proofErr w:type="spellEnd"/>
-      <w:r>
-        <w:rPr>
-          <w:b/>
-          <w:bCs/>
-          <w:i/>
-          <w:sz w:val="18"/>
-          <w:szCs w:val="18"/>
-        </w:rPr>
-        <w:t xml:space="preserve"> systems</w:t>
+        <w:t>AI-native engineering focused on automating company-wide systems</w:t>
       </w:r>
     </w:p>
     <w:p>
@@ -954,7 +903,7 @@
           <w:sz w:val="18"/>
           <w:szCs w:val="22"/>
         </w:rPr>
-        <w:t>Multi layered agent orchestrations to automate Product processes</w:t>
+        <w:t>Multi-layered agent orchestrations to automate Product processes</w:t>
       </w:r>
     </w:p>
     <w:p>
@@ -1073,7 +1022,25 @@
           <w:sz w:val="18"/>
           <w:szCs w:val="22"/>
         </w:rPr>
-        <w:t>Mentoring and building others skillsets</w:t>
+        <w:t>Mentoring and building others</w:t>
+      </w:r>
+      <w:r>
+        <w:rPr>
+          <w:b/>
+          <w:bCs/>
+          <w:sz w:val="18"/>
+          <w:szCs w:val="22"/>
+        </w:rPr>
+        <w:t>’</w:t>
+      </w:r>
+      <w:r>
+        <w:rPr>
+          <w:b/>
+          <w:bCs/>
+          <w:sz w:val="18"/>
+          <w:szCs w:val="22"/>
+        </w:rPr>
+        <w:t xml:space="preserve"> skillsets</w:t>
       </w:r>
     </w:p>
     <w:p>
@@ -1127,7 +1094,10 @@
         <w:t xml:space="preserve">Software Engineer </w:t>
       </w:r>
       <w:r>
-        <w:t>– Platform Engineering</w:t>
+        <w:t>-</w:t>
+      </w:r>
+      <w:r>
+        <w:t xml:space="preserve"> Platform Engineering</w:t>
       </w:r>
     </w:p>
     <w:p>
@@ -1147,7 +1117,23 @@
           <w:sz w:val="18"/>
           <w:szCs w:val="22"/>
         </w:rPr>
-        <w:t xml:space="preserve">T Rowe Price | </w:t>
+        <w:t>T</w:t>
+      </w:r>
+      <w:r>
+        <w:rPr>
+          <w:i/>
+          <w:sz w:val="18"/>
+          <w:szCs w:val="22"/>
+        </w:rPr>
+        <w:t>.</w:t>
+      </w:r>
+      <w:r>
+        <w:rPr>
+          <w:i/>
+          <w:sz w:val="18"/>
+          <w:szCs w:val="22"/>
+        </w:rPr>
+        <w:t xml:space="preserve"> Rowe Price | </w:t>
       </w:r>
       <w:r>
         <w:rPr>
@@ -1241,6 +1227,7 @@
         <w:t>{{</w:t>
       </w:r>
       <w:proofErr w:type="spellStart"/>
+      <w:proofErr w:type="gramStart"/>
       <w:r>
         <w:rPr>
           <w:i/>
@@ -1250,6 +1237,7 @@
         <w:t>t.skills</w:t>
       </w:r>
       <w:proofErr w:type="spellEnd"/>
+      <w:proofErr w:type="gramEnd"/>
       <w:r>
         <w:rPr>
           <w:i/>
@@ -1359,7 +1347,43 @@
           <w:sz w:val="18"/>
           <w:szCs w:val="22"/>
         </w:rPr>
-        <w:t>Legacy to Cloud Migration</w:t>
+        <w:t>Legacy</w:t>
+      </w:r>
+      <w:r>
+        <w:rPr>
+          <w:b/>
+          <w:bCs/>
+          <w:sz w:val="18"/>
+          <w:szCs w:val="22"/>
+        </w:rPr>
+        <w:t>-</w:t>
+      </w:r>
+      <w:r>
+        <w:rPr>
+          <w:b/>
+          <w:bCs/>
+          <w:sz w:val="18"/>
+          <w:szCs w:val="22"/>
+        </w:rPr>
+        <w:t>to</w:t>
+      </w:r>
+      <w:r>
+        <w:rPr>
+          <w:b/>
+          <w:bCs/>
+          <w:sz w:val="18"/>
+          <w:szCs w:val="22"/>
+        </w:rPr>
+        <w:t>-</w:t>
+      </w:r>
+      <w:r>
+        <w:rPr>
+          <w:b/>
+          <w:bCs/>
+          <w:sz w:val="18"/>
+          <w:szCs w:val="22"/>
+        </w:rPr>
+        <w:t>Cloud Migration</w:t>
       </w:r>
     </w:p>
     <w:p>
@@ -1556,7 +1580,13 @@
         <w:t>Systems Analyst</w:t>
       </w:r>
       <w:r>
-        <w:t xml:space="preserve"> – </w:t>
+        <w:t xml:space="preserve"> </w:t>
+      </w:r>
+      <w:r>
+        <w:t>-</w:t>
+      </w:r>
+      <w:r>
+        <w:t xml:space="preserve"> </w:t>
       </w:r>
       <w:r>
         <w:t xml:space="preserve">Platform </w:t>
@@ -3394,7 +3424,6 @@
   <w:style w:type="character" w:default="1" w:styleId="DefaultParagraphFont">
     <w:name w:val="Default Paragraph Font"/>
     <w:uiPriority w:val="1"/>
-    <w:semiHidden/>
     <w:unhideWhenUsed/>
   </w:style>
   <w:style w:type="table" w:default="1" w:styleId="TableNormal">

</xml_diff>